<commit_message>
Update Sprint 4 meeting and review evidence
</commit_message>
<xml_diff>
--- a/docs/final-submission/scrum-methodology/evidence/Sprint 4.docx
+++ b/docs/final-submission/scrum-methodology/evidence/Sprint 4.docx
@@ -4,60 +4,21 @@
   <w:body>
     <w:p>
       <w:r>
-        <w:t>Sprint 4 Meeting Evidence</w:t>
-      </w:r>
-      <w:r>
-        <w:br/>
-      </w:r>
-      <w:r>
-        <w:br/>
-        <w:t>Project: Campus Food Ordering Platform</w:t>
-      </w:r>
-      <w:r>
-        <w:br/>
-        <w:t>Sprint: Sprint 4</w:t>
-      </w:r>
-      <w:r>
-        <w:br/>
-        <w:t>Evidence Type: Meeting screenshots and Scrum communication evidence</w:t>
-      </w:r>
-      <w:r>
-        <w:br/>
-      </w:r>
-      <w:r>
-        <w:br/>
-        <w:t>Meeting Screenshots Included</w:t>
-      </w:r>
-      <w:r>
-        <w:br/>
-      </w:r>
-      <w:r>
-        <w:br/>
-        <w:t>1. Sprint 4 Planning and Task Breakdown Meeting</w:t>
-      </w:r>
-      <w:r>
-        <w:br/>
-        <w:t>Date: 12 May 2026</w:t>
-      </w:r>
-      <w:r>
-        <w:br/>
-        <w:t>Duration: 25 minutes</w:t>
-      </w:r>
-      <w:r>
-        <w:br/>
-        <w:t>Purpose: Sprint 4 analytics goal, task breakdown, team roles, work order, and dependencies.</w:t>
-      </w:r>
-      <w:r>
-        <w:br/>
-      </w:r>
-      <w:r>
-        <w:br/>
-      </w:r>
-      <w:r>
+        <w:rPr>
+          <w:noProof/>
+        </w:rPr>
         <w:drawing>
-          <wp:inline distT="0" distB="0" distL="0" distR="0" wp14:anchorId="6FB50B17" wp14:editId="0F775AB5">
-            <wp:extent cx="3177815" cy="3756986"/>
-            <wp:effectExtent l="0" t="0" r="3810" b="0"/>
+          <wp:anchor distT="0" distB="0" distL="114300" distR="114300" simplePos="0" relativeHeight="251659264" behindDoc="0" locked="0" layoutInCell="1" allowOverlap="1" wp14:anchorId="07C9F076" wp14:editId="453AFB07">
+            <wp:simplePos x="0" y="0"/>
+            <wp:positionH relativeFrom="margin">
+              <wp:posOffset>605790</wp:posOffset>
+            </wp:positionH>
+            <wp:positionV relativeFrom="paragraph">
+              <wp:posOffset>2659380</wp:posOffset>
+            </wp:positionV>
+            <wp:extent cx="1862455" cy="2202180"/>
+            <wp:effectExtent l="0" t="0" r="4445" b="7620"/>
+            <wp:wrapSquare wrapText="bothSides"/>
             <wp:docPr id="1263515695" name="Picture 1"/>
             <wp:cNvGraphicFramePr>
               <a:graphicFrameLocks xmlns:a="http://schemas.openxmlformats.org/drawingml/2006/main" noChangeAspect="1"/>
@@ -70,7 +31,13 @@
                     <pic:cNvPicPr/>
                   </pic:nvPicPr>
                   <pic:blipFill>
-                    <a:blip r:embed="rId4"/>
+                    <a:blip r:embed="rId4">
+                      <a:extLst>
+                        <a:ext uri="{28A0092B-C50C-407E-A947-70E740481C1C}">
+                          <a14:useLocalDpi xmlns:a14="http://schemas.microsoft.com/office/drawing/2010/main" val="0"/>
+                        </a:ext>
+                      </a:extLst>
+                    </a:blip>
                     <a:stretch>
                       <a:fillRect/>
                     </a:stretch>
@@ -78,7 +45,7 @@
                   <pic:spPr>
                     <a:xfrm>
                       <a:off x="0" y="0"/>
-                      <a:ext cx="3177815" cy="3756986"/>
+                      <a:ext cx="1862455" cy="2202180"/>
                     </a:xfrm>
                     <a:prstGeom prst="rect">
                       <a:avLst/>
@@ -87,14 +54,85 @@
                 </pic:pic>
               </a:graphicData>
             </a:graphic>
-          </wp:inline>
+            <wp14:sizeRelH relativeFrom="page">
+              <wp14:pctWidth>0</wp14:pctWidth>
+            </wp14:sizeRelH>
+            <wp14:sizeRelV relativeFrom="page">
+              <wp14:pctHeight>0</wp14:pctHeight>
+            </wp14:sizeRelV>
+          </wp:anchor>
         </w:drawing>
       </w:r>
       <w:r>
-        <w:br/>
-      </w:r>
-      <w:r>
-        <w:br/>
+        <w:t>Sprint 4 Meeting Evidence</w:t>
+      </w:r>
+      <w:r>
+        <w:br/>
+      </w:r>
+      <w:r>
+        <w:br/>
+        <w:t>Project: Campus Food Ordering Platform</w:t>
+      </w:r>
+      <w:r>
+        <w:br/>
+        <w:t>Sprint: Sprint 4</w:t>
+      </w:r>
+      <w:r>
+        <w:br/>
+        <w:t>Evidence Type: Meeting screenshots and Scrum communication evidence</w:t>
+      </w:r>
+      <w:r>
+        <w:br/>
+      </w:r>
+      <w:r>
+        <w:br/>
+        <w:t>Meeting Screenshots Included</w:t>
+      </w:r>
+      <w:r>
+        <w:br/>
+      </w:r>
+      <w:r>
+        <w:br/>
+        <w:t>1. Sprint 4 Planning and Task Breakdown Meeting</w:t>
+      </w:r>
+      <w:r>
+        <w:br/>
+        <w:t>Date: 12 May 2026</w:t>
+      </w:r>
+      <w:r>
+        <w:br/>
+        <w:t>Duration: 25 minutes</w:t>
+      </w:r>
+      <w:r>
+        <w:br/>
+        <w:t>Purpose: Sprint 4 analytics goal, task breakdown, team roles, work order, and dependencies.</w:t>
+      </w:r>
+      <w:r>
+        <w:br/>
+      </w:r>
+      <w:r>
+        <w:br/>
+      </w:r>
+      <w:r>
+        <w:br/>
+      </w:r>
+      <w:r>
+        <w:br/>
+      </w:r>
+    </w:p>
+    <w:p/>
+    <w:p/>
+    <w:p/>
+    <w:p/>
+    <w:p/>
+    <w:p/>
+    <w:p>
+      <w:pPr>
+        <w:rPr>
+          <w:noProof/>
+        </w:rPr>
+      </w:pPr>
+      <w:r>
         <w:t>2. Sprint 4 Daily Scrum / Branch Coordination Meeting</w:t>
       </w:r>
       <w:r>
@@ -115,20 +153,29 @@
       </w:r>
       <w:proofErr w:type="spellEnd"/>
       <w:r>
-        <w:t xml:space="preserve">/analytics endpoint discussion, </w:t>
-      </w:r>
-      <w:r>
-        <w:lastRenderedPageBreak/>
-        <w:t>branch coordination, and conflict prevention plan.</w:t>
-      </w:r>
-      <w:r>
-        <w:br/>
-      </w:r>
-      <w:r>
+        <w:t>/analytics endpoint discussion, branch coordination, and conflict prevention plan.</w:t>
+      </w:r>
+      <w:r>
+        <w:br/>
+      </w:r>
+    </w:p>
+    <w:p>
+      <w:r>
+        <w:rPr>
+          <w:noProof/>
+        </w:rPr>
         <w:drawing>
-          <wp:inline distT="0" distB="0" distL="0" distR="0" wp14:anchorId="282D490D" wp14:editId="6C58389C">
-            <wp:extent cx="2438611" cy="2972058"/>
+          <wp:anchor distT="0" distB="0" distL="114300" distR="114300" simplePos="0" relativeHeight="251658240" behindDoc="0" locked="0" layoutInCell="1" allowOverlap="1" wp14:anchorId="282D490D" wp14:editId="762CDCEE">
+            <wp:simplePos x="0" y="0"/>
+            <wp:positionH relativeFrom="margin">
+              <wp:posOffset>601980</wp:posOffset>
+            </wp:positionH>
+            <wp:positionV relativeFrom="paragraph">
+              <wp:posOffset>7620</wp:posOffset>
+            </wp:positionV>
+            <wp:extent cx="1836420" cy="2237740"/>
             <wp:effectExtent l="0" t="0" r="0" b="0"/>
+            <wp:wrapSquare wrapText="bothSides"/>
             <wp:docPr id="140652049" name="Picture 1"/>
             <wp:cNvGraphicFramePr>
               <a:graphicFrameLocks xmlns:a="http://schemas.openxmlformats.org/drawingml/2006/main" noChangeAspect="1"/>
@@ -141,7 +188,13 @@
                     <pic:cNvPicPr/>
                   </pic:nvPicPr>
                   <pic:blipFill>
-                    <a:blip r:embed="rId5"/>
+                    <a:blip r:embed="rId5">
+                      <a:extLst>
+                        <a:ext uri="{28A0092B-C50C-407E-A947-70E740481C1C}">
+                          <a14:useLocalDpi xmlns:a14="http://schemas.microsoft.com/office/drawing/2010/main" val="0"/>
+                        </a:ext>
+                      </a:extLst>
+                    </a:blip>
                     <a:stretch>
                       <a:fillRect/>
                     </a:stretch>
@@ -149,7 +202,7 @@
                   <pic:spPr>
                     <a:xfrm>
                       <a:off x="0" y="0"/>
-                      <a:ext cx="2438611" cy="2972058"/>
+                      <a:ext cx="1836420" cy="2237740"/>
                     </a:xfrm>
                     <a:prstGeom prst="rect">
                       <a:avLst/>
@@ -158,8 +211,284 @@
                 </pic:pic>
               </a:graphicData>
             </a:graphic>
-          </wp:inline>
+            <wp14:sizeRelH relativeFrom="page">
+              <wp14:pctWidth>0</wp14:pctWidth>
+            </wp14:sizeRelH>
+            <wp14:sizeRelV relativeFrom="page">
+              <wp14:pctHeight>0</wp14:pctHeight>
+            </wp14:sizeRelV>
+          </wp:anchor>
         </w:drawing>
+      </w:r>
+    </w:p>
+    <w:p>
+      <w:pPr>
+        <w:rPr>
+          <w:noProof/>
+        </w:rPr>
+      </w:pPr>
+    </w:p>
+    <w:p>
+      <w:pPr>
+        <w:rPr>
+          <w:noProof/>
+        </w:rPr>
+      </w:pPr>
+    </w:p>
+    <w:p>
+      <w:pPr>
+        <w:rPr>
+          <w:noProof/>
+        </w:rPr>
+      </w:pPr>
+    </w:p>
+    <w:p>
+      <w:pPr>
+        <w:rPr>
+          <w:noProof/>
+        </w:rPr>
+      </w:pPr>
+    </w:p>
+    <w:p>
+      <w:pPr>
+        <w:rPr>
+          <w:noProof/>
+        </w:rPr>
+      </w:pPr>
+    </w:p>
+    <w:p>
+      <w:pPr>
+        <w:tabs>
+          <w:tab w:val="left" w:pos="2268"/>
+        </w:tabs>
+        <w:rPr>
+          <w:noProof/>
+        </w:rPr>
+      </w:pPr>
+    </w:p>
+    <w:p>
+      <w:pPr>
+        <w:tabs>
+          <w:tab w:val="left" w:pos="2268"/>
+        </w:tabs>
+        <w:rPr>
+          <w:noProof/>
+        </w:rPr>
+      </w:pPr>
+    </w:p>
+    <w:p>
+      <w:pPr>
+        <w:tabs>
+          <w:tab w:val="left" w:pos="2268"/>
+        </w:tabs>
+      </w:pPr>
+      <w:r>
+        <w:lastRenderedPageBreak/>
+        <w:t>3. Sprint 4 Daily Scrum / Final Sprint Preparation Meeting</w:t>
+      </w:r>
+    </w:p>
+    <w:p>
+      <w:pPr>
+        <w:tabs>
+          <w:tab w:val="left" w:pos="2268"/>
+        </w:tabs>
+      </w:pPr>
+      <w:r>
+        <w:t>Date: 17 May 2026</w:t>
+      </w:r>
+    </w:p>
+    <w:p>
+      <w:pPr>
+        <w:tabs>
+          <w:tab w:val="left" w:pos="2268"/>
+        </w:tabs>
+      </w:pPr>
+      <w:r>
+        <w:t>Duration: 10 minutes</w:t>
+      </w:r>
+    </w:p>
+    <w:p>
+      <w:pPr>
+        <w:tabs>
+          <w:tab w:val="left" w:pos="2268"/>
+        </w:tabs>
+      </w:pPr>
+      <w:r>
+        <w:t>Purpose: Sprint 4 progress check, PDF export discussion, UML diagram reminder, final video planning, and final report preparation.</w:t>
+      </w:r>
+    </w:p>
+    <w:p>
+      <w:pPr>
+        <w:tabs>
+          <w:tab w:val="left" w:pos="2268"/>
+        </w:tabs>
+      </w:pPr>
+      <w:r>
+        <w:drawing>
+          <wp:anchor distT="0" distB="0" distL="114300" distR="114300" simplePos="0" relativeHeight="251660288" behindDoc="0" locked="0" layoutInCell="1" allowOverlap="1" wp14:anchorId="44F53920" wp14:editId="0D1AC4A8">
+            <wp:simplePos x="0" y="0"/>
+            <wp:positionH relativeFrom="column">
+              <wp:posOffset>1112520</wp:posOffset>
+            </wp:positionH>
+            <wp:positionV relativeFrom="paragraph">
+              <wp:posOffset>10160</wp:posOffset>
+            </wp:positionV>
+            <wp:extent cx="2247900" cy="2909570"/>
+            <wp:effectExtent l="0" t="0" r="0" b="5080"/>
+            <wp:wrapSquare wrapText="bothSides"/>
+            <wp:docPr id="768425887" name="Picture 1"/>
+            <wp:cNvGraphicFramePr>
+              <a:graphicFrameLocks xmlns:a="http://schemas.openxmlformats.org/drawingml/2006/main" noChangeAspect="1"/>
+            </wp:cNvGraphicFramePr>
+            <a:graphic xmlns:a="http://schemas.openxmlformats.org/drawingml/2006/main">
+              <a:graphicData uri="http://schemas.openxmlformats.org/drawingml/2006/picture">
+                <pic:pic xmlns:pic="http://schemas.openxmlformats.org/drawingml/2006/picture">
+                  <pic:nvPicPr>
+                    <pic:cNvPr id="768425887" name=""/>
+                    <pic:cNvPicPr/>
+                  </pic:nvPicPr>
+                  <pic:blipFill>
+                    <a:blip r:embed="rId6">
+                      <a:extLst>
+                        <a:ext uri="{28A0092B-C50C-407E-A947-70E740481C1C}">
+                          <a14:useLocalDpi xmlns:a14="http://schemas.microsoft.com/office/drawing/2010/main" val="0"/>
+                        </a:ext>
+                      </a:extLst>
+                    </a:blip>
+                    <a:stretch>
+                      <a:fillRect/>
+                    </a:stretch>
+                  </pic:blipFill>
+                  <pic:spPr>
+                    <a:xfrm>
+                      <a:off x="0" y="0"/>
+                      <a:ext cx="2247900" cy="2909570"/>
+                    </a:xfrm>
+                    <a:prstGeom prst="rect">
+                      <a:avLst/>
+                    </a:prstGeom>
+                  </pic:spPr>
+                </pic:pic>
+              </a:graphicData>
+            </a:graphic>
+            <wp14:sizeRelH relativeFrom="page">
+              <wp14:pctWidth>0</wp14:pctWidth>
+            </wp14:sizeRelH>
+            <wp14:sizeRelV relativeFrom="page">
+              <wp14:pctHeight>0</wp14:pctHeight>
+            </wp14:sizeRelV>
+          </wp:anchor>
+        </w:drawing>
+      </w:r>
+    </w:p>
+    <w:p>
+      <w:pPr>
+        <w:tabs>
+          <w:tab w:val="left" w:pos="2268"/>
+        </w:tabs>
+      </w:pPr>
+    </w:p>
+    <w:p>
+      <w:pPr>
+        <w:tabs>
+          <w:tab w:val="left" w:pos="2268"/>
+        </w:tabs>
+      </w:pPr>
+    </w:p>
+    <w:p>
+      <w:pPr>
+        <w:tabs>
+          <w:tab w:val="left" w:pos="2268"/>
+        </w:tabs>
+      </w:pPr>
+    </w:p>
+    <w:p>
+      <w:pPr>
+        <w:tabs>
+          <w:tab w:val="left" w:pos="2268"/>
+        </w:tabs>
+      </w:pPr>
+    </w:p>
+    <w:p>
+      <w:pPr>
+        <w:tabs>
+          <w:tab w:val="left" w:pos="2268"/>
+        </w:tabs>
+      </w:pPr>
+    </w:p>
+    <w:p>
+      <w:pPr>
+        <w:tabs>
+          <w:tab w:val="left" w:pos="2268"/>
+        </w:tabs>
+      </w:pPr>
+    </w:p>
+    <w:p>
+      <w:pPr>
+        <w:tabs>
+          <w:tab w:val="left" w:pos="2268"/>
+        </w:tabs>
+      </w:pPr>
+    </w:p>
+    <w:p>
+      <w:pPr>
+        <w:tabs>
+          <w:tab w:val="left" w:pos="2268"/>
+        </w:tabs>
+      </w:pPr>
+    </w:p>
+    <w:p>
+      <w:pPr>
+        <w:tabs>
+          <w:tab w:val="left" w:pos="2268"/>
+        </w:tabs>
+      </w:pPr>
+    </w:p>
+    <w:p>
+      <w:pPr>
+        <w:tabs>
+          <w:tab w:val="left" w:pos="2268"/>
+        </w:tabs>
+      </w:pPr>
+    </w:p>
+    <w:p>
+      <w:pPr>
+        <w:tabs>
+          <w:tab w:val="left" w:pos="2268"/>
+        </w:tabs>
+      </w:pPr>
+      <w:r>
+        <w:t>4. Sprint 4 Sprint Review / Methodology Review Meeting</w:t>
+      </w:r>
+    </w:p>
+    <w:p>
+      <w:pPr>
+        <w:tabs>
+          <w:tab w:val="left" w:pos="2268"/>
+        </w:tabs>
+      </w:pPr>
+      <w:r>
+        <w:t>Date: To be added after review</w:t>
+      </w:r>
+    </w:p>
+    <w:p>
+      <w:pPr>
+        <w:tabs>
+          <w:tab w:val="left" w:pos="2268"/>
+        </w:tabs>
+      </w:pPr>
+      <w:r>
+        <w:t>Duration: To be added after review</w:t>
+      </w:r>
+    </w:p>
+    <w:p>
+      <w:pPr>
+        <w:tabs>
+          <w:tab w:val="left" w:pos="2268"/>
+        </w:tabs>
+      </w:pPr>
+      <w:r>
+        <w:t>Purpose: Review final Sprint 4 work, Scrum methodology evidence, final artefacts, and readiness for final project submission.</w:t>
       </w:r>
     </w:p>
     <w:sectPr>
@@ -775,6 +1104,7 @@
   <w:style w:type="character" w:default="1" w:styleId="DefaultParagraphFont">
     <w:name w:val="Default Paragraph Font"/>
     <w:uiPriority w:val="1"/>
+    <w:semiHidden/>
     <w:unhideWhenUsed/>
   </w:style>
   <w:style w:type="table" w:default="1" w:styleId="TableNormal">

</xml_diff>